<commit_message>
Stabilize Case Engine v1 (auth + cases + documents) and repo hygiene
</commit_message>
<xml_diff>
--- a/docs/Canon.docx
+++ b/docs/Canon.docx
@@ -14,17 +14,17 @@
     </w:p>
     <w:p>
       <w:r>
-        <w:t>Última actualización: 21/12/2025</w:t>
-      </w:r>
-    </w:p>
-    <w:p>
-      <w:r>
-        <w:t>Fases cerradas: 0 (repo/CI), 2 (UI system mínimo), 3 (arquitectura), 5 (frontend core)</w:t>
-      </w:r>
-    </w:p>
-    <w:p>
-      <w:r>
-        <w:t>Repo: https://github.com/andresbedoya22-ctrl/FinHub (rama de trabajo: phase-5-frontend-core)</w:t>
+        <w:t>Última actualización: 21/12/2025 (Auth Supabase + Case Engine v1 estable; limpieza de duplicados y flujo end-to-end funcional)</w:t>
+      </w:r>
+    </w:p>
+    <w:p>
+      <w:r>
+        <w:t>Fases cerradas: 0 (repo/CI), 2 (UI system mínimo), 3 (arquitectura), 5 (frontend core + Case Engine v1 + Document Vault v1). Fase 4: EN CURSO (data contracts + SQL/RLS).</w:t>
+      </w:r>
+    </w:p>
+    <w:p>
+      <w:r>
+        <w:t>Repo: https://github.com/andresbedoya22-ctrl/FinHub (rama actual de estabilización: fix/case-engine-v1-stabilize; origen: chore/supabase-auth).</w:t>
       </w:r>
     </w:p>
     <w:p>
@@ -111,7 +111,15 @@
       </w:r>
       <w:r>
         <w:tab/>
-        <w:t>[CONFIRMADO EN CHAT] Idiomas: UI + contenido completos; idioma se elige y se puede cambiar en perfil sin UI cargada.</w:t>
+        <w:t xml:space="preserve">[CONFIRMADO EN CHAT] Idiomas: UI + </w:t>
+      </w:r>
+      <w:proofErr w:type="gramStart"/>
+      <w:r>
+        <w:t>contenido completos</w:t>
+      </w:r>
+      <w:proofErr w:type="gramEnd"/>
+      <w:r>
+        <w:t>; idioma se elige y se puede cambiar en perfil sin UI cargada.</w:t>
       </w:r>
     </w:p>
     <w:p>
@@ -143,7 +151,164 @@
     </w:p>
     <w:p>
       <w:r>
-        <w:t>[CERRADO 21/12/2025] Fase 5 (Frontend Core): route guard stub, Case Engine v1 (persistencia local) y Document Vault v1.</w:t>
+        <w:lastRenderedPageBreak/>
+        <w:t>o</w:t>
+      </w:r>
+      <w:r>
+        <w:tab/>
+        <w:t>[CERRADO 21/12/2025] Fase 5 (Frontend Core): route guard funcional + Auth Supabase (email/pass) + Case Engine v1 (DB Supabase) + Document Vault v1 (DB/Storage base).</w:t>
+      </w:r>
+    </w:p>
+    <w:p>
+      <w:r>
+        <w:t>o</w:t>
+      </w:r>
+      <w:r>
+        <w:tab/>
+        <w:t>[EN CURSO 21/12/2025] Fase 4 (Data Contracts): formalizar OpenAPI v1 + schema SQL/migrations + RLS completa; hoy existe esquema mínimo en Supabase para cases y documents.</w:t>
+      </w:r>
+    </w:p>
+    <w:p>
+      <w:r>
+        <w:t>•</w:t>
+      </w:r>
+      <w:r>
+        <w:tab/>
+        <w:t>Próximo objetivo: CERRAR Fase 4 (contratos + SQL/RLS + migraciones) y dejar el frontend consumiendo DB con garantías (tests + CI).</w:t>
+      </w:r>
+    </w:p>
+    <w:p>
+      <w:r>
+        <w:t>Cambios recientes (21/12/2025) — estabilización real (sin improvisación):</w:t>
+      </w:r>
+    </w:p>
+    <w:p>
+      <w:r>
+        <w:t>• Integración Supabase Auth (email/password) y sesión; desactivación temporal de confirmación de email en entorno dev para acelerar pruebas.</w:t>
+      </w:r>
+    </w:p>
+    <w:p>
+      <w:r>
+        <w:t>• Rutas de Auth bajo src/app/(auth)/login y src/app/(auth)/register (app router).</w:t>
+      </w:r>
+    </w:p>
+    <w:p>
+      <w:r>
+        <w:t>• Middleware/guard para proteger /app y redirección a /login cuando no hay sesión.</w:t>
+      </w:r>
+    </w:p>
+    <w:p>
+      <w:r>
+        <w:t>• Case Engine v1: crear/listar/borrar/ver caso + navegación por steps; persistencia en tabla cases (Supabase).</w:t>
+      </w:r>
+    </w:p>
+    <w:p>
+      <w:r>
+        <w:t>• Drafts por step: store separado (caseDraftsStore) para editar sin perder cambios entre steps; StepClient consume getDraft/setDraft.</w:t>
+      </w:r>
+    </w:p>
+    <w:p>
+      <w:r>
+        <w:t>• Limpieza de duplicados (casesStore.tsx/.bak) para evitar imports inconsistentes y errores intermitentes.</w:t>
+      </w:r>
+    </w:p>
+    <w:p>
+      <w:r>
+        <w:t>• Higiene repo</w:t>
+      </w:r>
+      <w:proofErr w:type="gramStart"/>
+      <w:r>
+        <w:t>: .env</w:t>
+      </w:r>
+      <w:proofErr w:type="gramEnd"/>
+      <w:r>
+        <w:t>.local fuera de Git, backups y _archive_fix fuera de tracking (</w:t>
+      </w:r>
+      <w:proofErr w:type="gramStart"/>
+      <w:r>
+        <w:t>via .gitignore</w:t>
+      </w:r>
+      <w:proofErr w:type="gramEnd"/>
+      <w:r>
+        <w:t>).</w:t>
+      </w:r>
+    </w:p>
+    <w:p>
+      <w:r>
+        <w:t>________________________________________</w:t>
+      </w:r>
+    </w:p>
+    <w:p>
+      <w:r>
+        <w:t>1. Alcance v1 (In/Out)</w:t>
+      </w:r>
+    </w:p>
+    <w:p>
+      <w:r>
+        <w:t>1.1 Qué incluye v1 (In Scope)</w:t>
+      </w:r>
+    </w:p>
+    <w:p>
+      <w:r>
+        <w:t>•</w:t>
+      </w:r>
+      <w:r>
+        <w:tab/>
+        <w:t>Web responsive (mobile-first, desktop sólido).</w:t>
+      </w:r>
+    </w:p>
+    <w:p>
+      <w:r>
+        <w:t>•</w:t>
+      </w:r>
+      <w:r>
+        <w:tab/>
+        <w:t>Subsidios (Toeslagen 2026): flujos tipo wizard con eligibility → resultado → checkout → authorization → docs checklist → estado “en revisión humana”.</w:t>
+      </w:r>
+    </w:p>
+    <w:p>
+      <w:r>
+        <w:t>•</w:t>
+      </w:r>
+      <w:r>
+        <w:tab/>
+        <w:t>Impuestos (IB + voorlopige aanslag): solo particulares; wizard mínimo + documentos + revisión humana (sin ZZP/BTW).</w:t>
+      </w:r>
+    </w:p>
+    <w:p>
+      <w:r>
+        <w:t>•</w:t>
+      </w:r>
+      <w:r>
+        <w:tab/>
+        <w:t>Finanzas personales: registro manual + subida OCR (no conexión bancaria en v1 si no es imprescindible).</w:t>
+      </w:r>
+    </w:p>
+    <w:p>
+      <w:r>
+        <w:t>•</w:t>
+      </w:r>
+      <w:r>
+        <w:tab/>
+        <w:t>Document Vault: almacenamiento, checklist, subida, estado, base para OCR/edición.</w:t>
+      </w:r>
+    </w:p>
+    <w:p>
+      <w:r>
+        <w:t>•</w:t>
+      </w:r>
+      <w:r>
+        <w:tab/>
+        <w:t>Seguros v1: informativo + CTAs + recomendaciones no intrusivas basadas en perfil (ver §6.6/§6.7).</w:t>
+      </w:r>
+    </w:p>
+    <w:p>
+      <w:r>
+        <w:t>•</w:t>
+      </w:r>
+      <w:r>
+        <w:tab/>
+        <w:t>Pagos: suscripción + pago por caso.</w:t>
       </w:r>
     </w:p>
     <w:p>
@@ -153,7 +318,134 @@
       </w:r>
       <w:r>
         <w:tab/>
-        <w:t>Próximo objetivo: iniciar Fase 4 (modelo de datos + contratos OpenAPI v1): definir entidades (User, Case, Document, Payment, Consent) y contratos para backend.</w:t>
+        <w:t>IA/Asistente: guía contextual y validación básica (sin dar asesoramiento regulado como si fuera un broker).</w:t>
+      </w:r>
+    </w:p>
+    <w:p>
+      <w:r>
+        <w:t>1.2 Qué NO incluye v1 (Out of Scope)</w:t>
+      </w:r>
+    </w:p>
+    <w:p>
+      <w:r>
+        <w:t>•</w:t>
+      </w:r>
+      <w:r>
+        <w:tab/>
+        <w:t>ZZP / BTW (IVA), contabilidad de empresa.</w:t>
+      </w:r>
+    </w:p>
+    <w:p>
+      <w:r>
+        <w:t>•</w:t>
+      </w:r>
+      <w:r>
+        <w:tab/>
+        <w:t>Automatización completa de envío a Belastingdienst sin revisión humana.</w:t>
+      </w:r>
+    </w:p>
+    <w:p>
+      <w:r>
+        <w:t>•</w:t>
+      </w:r>
+      <w:r>
+        <w:tab/>
+        <w:t>Seguros v2 (operativo tipo “Polisa-style funnel” con intermediación completa) — futuro.</w:t>
+      </w:r>
+    </w:p>
+    <w:p>
+      <w:r>
+        <w:t>•</w:t>
+      </w:r>
+      <w:r>
+        <w:tab/>
+        <w:t>PSD2/banking connections si no es necesario para el primer vertical slice.</w:t>
+      </w:r>
+    </w:p>
+    <w:p>
+      <w:r>
+        <w:t>1.3 Principios del producto (reglas no negociables)</w:t>
+      </w:r>
+    </w:p>
+    <w:p>
+      <w:r>
+        <w:t>1.</w:t>
+      </w:r>
+      <w:r>
+        <w:tab/>
+        <w:t>Web-first, mobile-perfect.</w:t>
+      </w:r>
+    </w:p>
+    <w:p>
+      <w:r>
+        <w:t>2.</w:t>
+      </w:r>
+      <w:r>
+        <w:tab/>
+        <w:t>Idioma nativo end-to-end (UI + contenido + emails + outputs).</w:t>
+      </w:r>
+    </w:p>
+    <w:p>
+      <w:r>
+        <w:t>3.</w:t>
+      </w:r>
+      <w:r>
+        <w:tab/>
+        <w:t>Gratis = pre-check; pago = ejecución por FinHub (no solo educación).</w:t>
+      </w:r>
+    </w:p>
+    <w:p>
+      <w:r>
+        <w:t>4.</w:t>
+      </w:r>
+      <w:r>
+        <w:tab/>
+        <w:t>Pago antes de trabajo operativo (conversión pre-check → pago como KPI).</w:t>
+      </w:r>
+    </w:p>
+    <w:p>
+      <w:r>
+        <w:t>5.</w:t>
+      </w:r>
+      <w:r>
+        <w:tab/>
+        <w:t>No almacenar credenciales DigiD; operar vía autorización/machtiging (Modo A).</w:t>
+      </w:r>
+    </w:p>
+    <w:p>
+      <w:r>
+        <w:t>6.</w:t>
+      </w:r>
+      <w:r>
+        <w:tab/>
+        <w:t>OCR/IA asistida + revisión humana obligatoria antes de enviar.</w:t>
+      </w:r>
+    </w:p>
+    <w:p>
+      <w:r>
+        <w:t>7.</w:t>
+      </w:r>
+      <w:r>
+        <w:tab/>
+        <w:t>Normativa objetivo 2026 para toeslagen en reglas y copy.</w:t>
+      </w:r>
+    </w:p>
+    <w:p>
+      <w:r>
+        <w:t>8.</w:t>
+      </w:r>
+      <w:r>
+        <w:tab/>
+        <w:t>UI simple, clara, no saturada (“gov-tech moderno”).</w:t>
+      </w:r>
+    </w:p>
+    <w:p>
+      <w:r>
+        <w:t>9.</w:t>
+      </w:r>
+      <w:r>
+        <w:tab/>
+        <w:t>Recomendaciones y ofertas no intrusivas (no spam): siempre con consentimiento, frecuencia controlada y valor real para el usuario (ver §6.7).</w:t>
       </w:r>
     </w:p>
     <w:p>
@@ -163,12 +455,96 @@
     </w:p>
     <w:p>
       <w:r>
-        <w:t>1. Alcance v1 (In/Out)</w:t>
-      </w:r>
-    </w:p>
-    <w:p>
-      <w:r>
-        <w:t>1.1 Qué incluye v1 (In Scope)</w:t>
+        <w:t>2. Reglas y Decisiones Fijas (Fuente de verdad)</w:t>
+      </w:r>
+    </w:p>
+    <w:p>
+      <w:r>
+        <w:t>1.</w:t>
+      </w:r>
+      <w:r>
+        <w:tab/>
+        <w:t>Plataforma v2.0: Web responsive (no app nativa).</w:t>
+      </w:r>
+    </w:p>
+    <w:p>
+      <w:r>
+        <w:t>2.</w:t>
+      </w:r>
+      <w:r>
+        <w:tab/>
+        <w:t>ZZP y BTW fuera de alcance actual.</w:t>
+      </w:r>
+    </w:p>
+    <w:p>
+      <w:r>
+        <w:t>3.</w:t>
+      </w:r>
+      <w:r>
+        <w:tab/>
+        <w:t>Modelo comercial: suscripción + pago por caso.</w:t>
+      </w:r>
+    </w:p>
+    <w:p>
+      <w:r>
+        <w:t>4.</w:t>
+      </w:r>
+      <w:r>
+        <w:tab/>
+        <w:t>Idiomas: ES/PL/RO/EN completos; idioma elegido en landing/perfil.</w:t>
+      </w:r>
+    </w:p>
+    <w:p>
+      <w:r>
+        <w:t>5.</w:t>
+      </w:r>
+      <w:r>
+        <w:tab/>
+        <w:t>Autorizar sin credenciales DigiD: Modo A como estándar (machtigingscode/proof).</w:t>
+      </w:r>
+    </w:p>
+    <w:p>
+      <w:r>
+        <w:t>6.</w:t>
+      </w:r>
+      <w:r>
+        <w:tab/>
+        <w:t>IA/OCR siempre “human-in-the-loop” para documentos y decisiones sensibles.</w:t>
+      </w:r>
+    </w:p>
+    <w:p>
+      <w:r>
+        <w:t>7.</w:t>
+      </w:r>
+      <w:r>
+        <w:tab/>
+        <w:t>Estilo UI: azul oscuro + acento verde; componentes grandes y legibles.</w:t>
+      </w:r>
+    </w:p>
+    <w:p>
+      <w:r>
+        <w:t>________________________________________</w:t>
+      </w:r>
+    </w:p>
+    <w:p>
+      <w:r>
+        <w:t>3. Arquitectura Técnica</w:t>
+      </w:r>
+    </w:p>
+    <w:p>
+      <w:r>
+        <w:t>Estado de Fase 3 (Arquitectura): CERRADA (19/12/2025).</w:t>
+      </w:r>
+    </w:p>
+    <w:p>
+      <w:r>
+        <w:lastRenderedPageBreak/>
+        <w:t>Decisión: Web-first; stack objetivo; autorización Modo A como estándar.</w:t>
+      </w:r>
+    </w:p>
+    <w:p>
+      <w:r>
+        <w:t>3.1 Stack (objetivo v1 web)</w:t>
       </w:r>
     </w:p>
     <w:p>
@@ -177,7 +553,7 @@
       </w:r>
       <w:r>
         <w:tab/>
-        <w:t>Web responsive (mobile-first, desktop sólido).</w:t>
+        <w:t>Frontend: Next.js (App Router) + TypeScript + Tailwind v4.</w:t>
       </w:r>
     </w:p>
     <w:p>
@@ -186,7 +562,7 @@
       </w:r>
       <w:r>
         <w:tab/>
-        <w:t>Subsidios (Toeslagen 2026): flujos tipo wizard con eligibility → resultado → checkout → authorization → docs checklist → estado “en revisión humana”.</w:t>
+        <w:t>Backend/DB/Auth/Storage (objetivo): Supabase (PostgreSQL + Auth + Storage + RLS; Edge Functions opcional).</w:t>
       </w:r>
     </w:p>
     <w:p>
@@ -195,7 +571,7 @@
       </w:r>
       <w:r>
         <w:tab/>
-        <w:t>Impuestos (IB + voorlopige aanslag): solo particulares; wizard mínimo + documentos + revisión humana (sin ZZP/BTW).</w:t>
+        <w:t>Pagos: Stripe (suscripción + pago por caso + webhooks).</w:t>
       </w:r>
     </w:p>
     <w:p>
@@ -204,7 +580,7 @@
       </w:r>
       <w:r>
         <w:tab/>
-        <w:t>Finanzas personales: registro manual + subida OCR (no conexión bancaria en v1 si no es imprescindible).</w:t>
+        <w:t>OCR: Azure AI Document Intelligence + editor manual + auditoría.</w:t>
       </w:r>
     </w:p>
     <w:p>
@@ -213,7 +589,316 @@
       </w:r>
       <w:r>
         <w:tab/>
-        <w:t>Document Vault: almacenamiento, checklist, subida, estado, base para OCR/edición.</w:t>
+        <w:t>Observabilidad: Sentry (frontend) + logging estructurado (server) + auditoría de eventos en DB.</w:t>
+      </w:r>
+    </w:p>
+    <w:p>
+      <w:r>
+        <w:t>Nota: el repo actual ya está en Next/TS/Tailwind v4. shadcn/ui queda como opcional; el UI kit mínimo existe en src/ui.</w:t>
+      </w:r>
+    </w:p>
+    <w:p>
+      <w:r>
+        <w:t>3.2 Estructura de proyecto (carpetas y convenciones) — ACTUALIZADA</w:t>
+      </w:r>
+    </w:p>
+    <w:p>
+      <w:r>
+        <w:t>Árbol actualizado confirmado (post-Fase 4):</w:t>
+      </w:r>
+    </w:p>
+    <w:p>
+      <w:r>
+        <w:t>src/</w:t>
+      </w:r>
+    </w:p>
+    <w:p>
+      <w:r>
+        <w:t xml:space="preserve">  app/</w:t>
+      </w:r>
+    </w:p>
+    <w:p>
+      <w:r>
+        <w:t xml:space="preserve">    (auth)/</w:t>
+      </w:r>
+    </w:p>
+    <w:p>
+      <w:r>
+        <w:t xml:space="preserve">      login/page.tsx</w:t>
+      </w:r>
+    </w:p>
+    <w:p>
+      <w:r>
+        <w:t xml:space="preserve">      register/page.tsx</w:t>
+      </w:r>
+    </w:p>
+    <w:p>
+      <w:r>
+        <w:t xml:space="preserve">    (dashboard)/</w:t>
+      </w:r>
+    </w:p>
+    <w:p>
+      <w:r>
+        <w:t xml:space="preserve">      app/</w:t>
+      </w:r>
+    </w:p>
+    <w:p>
+      <w:r>
+        <w:t xml:space="preserve">        layout.tsx</w:t>
+      </w:r>
+    </w:p>
+    <w:p>
+      <w:r>
+        <w:t xml:space="preserve">        providers.tsx</w:t>
+      </w:r>
+    </w:p>
+    <w:p>
+      <w:r>
+        <w:t xml:space="preserve">        page.tsx</w:t>
+      </w:r>
+    </w:p>
+    <w:p>
+      <w:r>
+        <w:t xml:space="preserve">        cases/</w:t>
+      </w:r>
+    </w:p>
+    <w:p>
+      <w:r>
+        <w:t xml:space="preserve">          page.tsx</w:t>
+      </w:r>
+    </w:p>
+    <w:p>
+      <w:r>
+        <w:t xml:space="preserve">          ui/CasesListClient.tsx</w:t>
+      </w:r>
+    </w:p>
+    <w:p>
+      <w:r>
+        <w:t xml:space="preserve">          new/page.tsx</w:t>
+      </w:r>
+    </w:p>
+    <w:p>
+      <w:r>
+        <w:t xml:space="preserve">          new/ui/NewCaseClient.tsx</w:t>
+      </w:r>
+    </w:p>
+    <w:p>
+      <w:r>
+        <w:t xml:space="preserve">          [id]/page.tsx</w:t>
+      </w:r>
+    </w:p>
+    <w:p>
+      <w:r>
+        <w:t xml:space="preserve">          [id]/ui/CaseOverviewClient.tsx</w:t>
+      </w:r>
+    </w:p>
+    <w:p>
+      <w:r>
+        <w:lastRenderedPageBreak/>
+        <w:t xml:space="preserve">          [id]/[stepKey]/page.tsx</w:t>
+      </w:r>
+    </w:p>
+    <w:p>
+      <w:r>
+        <w:t xml:space="preserve">          [id]/[stepKey]/ui/StepClient.tsx</w:t>
+      </w:r>
+    </w:p>
+    <w:p>
+      <w:r>
+        <w:t xml:space="preserve">        documents/</w:t>
+      </w:r>
+    </w:p>
+    <w:p>
+      <w:r>
+        <w:t xml:space="preserve">          page.tsx</w:t>
+      </w:r>
+    </w:p>
+    <w:p>
+      <w:r>
+        <w:t xml:space="preserve">          ui/DocumentsClient.tsx</w:t>
+      </w:r>
+    </w:p>
+    <w:p>
+      <w:r>
+        <w:t xml:space="preserve">        profile/page.tsx</w:t>
+      </w:r>
+    </w:p>
+    <w:p>
+      <w:r>
+        <w:t xml:space="preserve">        ui-kit/page.tsx</w:t>
+      </w:r>
+    </w:p>
+    <w:p>
+      <w:r>
+        <w:t xml:space="preserve">    (marketing)/</w:t>
+      </w:r>
+    </w:p>
+    <w:p>
+      <w:r>
+        <w:t xml:space="preserve">      landing/page.tsx</w:t>
+      </w:r>
+    </w:p>
+    <w:p>
+      <w:r>
+        <w:t xml:space="preserve">    layout.tsx</w:t>
+      </w:r>
+    </w:p>
+    <w:p>
+      <w:r>
+        <w:t xml:space="preserve">    page.tsx</w:t>
+      </w:r>
+    </w:p>
+    <w:p>
+      <w:r>
+        <w:t xml:space="preserve">  features/</w:t>
+      </w:r>
+    </w:p>
+    <w:p>
+      <w:r>
+        <w:t xml:space="preserve">    cases/</w:t>
+      </w:r>
+    </w:p>
+    <w:p>
+      <w:r>
+        <w:t xml:space="preserve">      casesClient.ts</w:t>
+      </w:r>
+    </w:p>
+    <w:p>
+      <w:r>
+        <w:t xml:space="preserve">      casesConfig.ts</w:t>
+      </w:r>
+    </w:p>
+    <w:p>
+      <w:r>
+        <w:t xml:space="preserve">      casesStorage.ts</w:t>
+      </w:r>
+    </w:p>
+    <w:p>
+      <w:r>
+        <w:t xml:space="preserve">      casesStore.ts</w:t>
+      </w:r>
+    </w:p>
+    <w:p>
+      <w:r>
+        <w:t xml:space="preserve">      caseDraftsStore.ts</w:t>
+      </w:r>
+    </w:p>
+    <w:p>
+      <w:r>
+        <w:t xml:space="preserve">      casesTypes.ts</w:t>
+      </w:r>
+    </w:p>
+    <w:p>
+      <w:r>
+        <w:t xml:space="preserve">    documents/</w:t>
+      </w:r>
+    </w:p>
+    <w:p>
+      <w:r>
+        <w:t xml:space="preserve">      documentsStorage.ts</w:t>
+      </w:r>
+    </w:p>
+    <w:p>
+      <w:r>
+        <w:t xml:space="preserve">      documentsStore.tsx</w:t>
+      </w:r>
+    </w:p>
+    <w:p>
+      <w:r>
+        <w:t xml:space="preserve">      documentsTypes.ts</w:t>
+      </w:r>
+    </w:p>
+    <w:p>
+      <w:r>
+        <w:t xml:space="preserve">  lib/</w:t>
+      </w:r>
+    </w:p>
+    <w:p>
+      <w:r>
+        <w:t xml:space="preserve">    supabase/</w:t>
+      </w:r>
+    </w:p>
+    <w:p>
+      <w:r>
+        <w:t xml:space="preserve">      browser.ts</w:t>
+      </w:r>
+    </w:p>
+    <w:p>
+      <w:r>
+        <w:t xml:space="preserve">      server.ts</w:t>
+      </w:r>
+    </w:p>
+    <w:p>
+      <w:r>
+        <w:t xml:space="preserve">  ui/</w:t>
+      </w:r>
+    </w:p>
+    <w:p>
+      <w:r>
+        <w:t xml:space="preserve">    components/* (Screen, Header, Card, Button, InfoBox, Badge, ...)</w:t>
+      </w:r>
+    </w:p>
+    <w:p>
+      <w:r>
+        <w:lastRenderedPageBreak/>
+        <w:t xml:space="preserve">    cn.ts</w:t>
+      </w:r>
+    </w:p>
+    <w:p/>
+    <w:p>
+      <w:r>
+        <w:t>Archivos raíz relevantes:</w:t>
+      </w:r>
+    </w:p>
+    <w:p>
+      <w:r>
+        <w:t xml:space="preserve">  middleware.ts (guard/SSR auth)</w:t>
+      </w:r>
+    </w:p>
+    <w:p>
+      <w:r>
+        <w:t xml:space="preserve">  </w:t>
+      </w:r>
+      <w:proofErr w:type="gramStart"/>
+      <w:r>
+        <w:t>.env</w:t>
+      </w:r>
+      <w:proofErr w:type="gramEnd"/>
+      <w:r>
+        <w:t>.local (NO COMMIT) — SUPABASE_URL, SUPABASE_ANON_KEY, etc.</w:t>
+      </w:r>
+    </w:p>
+    <w:p/>
+    <w:p/>
+    <w:p/>
+    <w:p/>
+    <w:p/>
+    <w:p/>
+    <w:p/>
+    <w:p/>
+    <w:p/>
+    <w:p/>
+    <w:p/>
+    <w:p/>
+    <w:p/>
+    <w:p/>
+    <w:p/>
+    <w:p/>
+    <w:p/>
+    <w:p/>
+    <w:p/>
+    <w:p/>
+    <w:p/>
+    <w:p/>
+    <w:p/>
+    <w:p/>
+    <w:p/>
+    <w:p/>
+    <w:p/>
+    <w:p/>
+    <w:p>
+      <w:r>
+        <w:t>3.3 Rutas v1 (mínimas)</w:t>
       </w:r>
     </w:p>
     <w:p>
@@ -222,7 +907,25 @@
       </w:r>
       <w:r>
         <w:tab/>
-        <w:t>Seguros v1: informativo + CTAs + recomendaciones no intrusivas basadas en perfil (ver §6.6/§6.7).</w:t>
+        <w:t>Público:</w:t>
+      </w:r>
+    </w:p>
+    <w:p>
+      <w:r>
+        <w:t>o</w:t>
+      </w:r>
+      <w:r>
+        <w:tab/>
+        <w:t>/landing</w:t>
+      </w:r>
+    </w:p>
+    <w:p>
+      <w:r>
+        <w:t>o</w:t>
+      </w:r>
+      <w:r>
+        <w:tab/>
+        <w:t>/login</w:t>
       </w:r>
     </w:p>
     <w:p>
@@ -231,7 +934,83 @@
       </w:r>
       <w:r>
         <w:tab/>
-        <w:t>Pagos: suscripción + pago por caso.</w:t>
+        <w:t>Privado:</w:t>
+      </w:r>
+    </w:p>
+    <w:p>
+      <w:r>
+        <w:t>o</w:t>
+      </w:r>
+      <w:r>
+        <w:tab/>
+        <w:t>/app</w:t>
+      </w:r>
+    </w:p>
+    <w:p>
+      <w:r>
+        <w:t>o</w:t>
+      </w:r>
+      <w:r>
+        <w:tab/>
+        <w:t>/app/cases</w:t>
+      </w:r>
+    </w:p>
+    <w:p>
+      <w:r>
+        <w:t>o</w:t>
+      </w:r>
+      <w:r>
+        <w:tab/>
+        <w:t>/app/cases/new</w:t>
+      </w:r>
+    </w:p>
+    <w:p>
+      <w:r>
+        <w:t>o</w:t>
+      </w:r>
+      <w:r>
+        <w:tab/>
+        <w:t>/app/cases/:id</w:t>
+      </w:r>
+    </w:p>
+    <w:p>
+      <w:r>
+        <w:t>/app/cases/:id</w:t>
+      </w:r>
+      <w:proofErr w:type="gramStart"/>
+      <w:r>
+        <w:t>/:stepKey</w:t>
+      </w:r>
+      <w:proofErr w:type="gramEnd"/>
+    </w:p>
+    <w:p>
+      <w:r>
+        <w:t>/app/documents</w:t>
+      </w:r>
+    </w:p>
+    <w:p>
+      <w:r>
+        <w:t>/app/profile</w:t>
+      </w:r>
+    </w:p>
+    <w:p>
+      <w:r>
+        <w:t>/app/ui-kit</w:t>
+      </w:r>
+    </w:p>
+    <w:p>
+      <w:r>
+        <w:t>________________________________________</w:t>
+      </w:r>
+    </w:p>
+    <w:p>
+      <w:r>
+        <w:t>4. Contratos y API (visión, aún no implementado)</w:t>
+      </w:r>
+    </w:p>
+    <w:p>
+      <w:r>
+        <w:t>Endpoints objetivo (alto nivel):</w:t>
       </w:r>
     </w:p>
     <w:p>
@@ -240,12 +1019,7 @@
       </w:r>
       <w:r>
         <w:tab/>
-        <w:t>IA/Asistente: guía contextual y validación básica (sin dar asesoramiento regulado como si fuera un broker).</w:t>
-      </w:r>
-    </w:p>
-    <w:p>
-      <w:r>
-        <w:t>1.2 Qué NO incluye v1 (Out of Scope)</w:t>
+        <w:t>/api/cases (POST create)</w:t>
       </w:r>
     </w:p>
     <w:p>
@@ -254,7 +1028,7 @@
       </w:r>
       <w:r>
         <w:tab/>
-        <w:t>ZZP / BTW (IVA), contabilidad de empresa.</w:t>
+        <w:t>/api/cases/:id (GET)</w:t>
       </w:r>
     </w:p>
     <w:p>
@@ -263,7 +1037,15 @@
       </w:r>
       <w:r>
         <w:tab/>
-        <w:t>Automatización completa de envío a Belastingdienst sin revisión humana.</w:t>
+        <w:t>/api/cases/:id/steps</w:t>
+      </w:r>
+      <w:proofErr w:type="gramStart"/>
+      <w:r>
+        <w:t>/:stepKey</w:t>
+      </w:r>
+      <w:proofErr w:type="gramEnd"/>
+      <w:r>
+        <w:t xml:space="preserve"> (PUT save step)</w:t>
       </w:r>
     </w:p>
     <w:p>
@@ -272,7 +1054,7 @@
       </w:r>
       <w:r>
         <w:tab/>
-        <w:t>Seguros v2 (operativo tipo “Polisa-style funnel” con intermediación completa) — futuro.</w:t>
+        <w:t>/api/cases/:id/documents (POST upload metadata)</w:t>
       </w:r>
     </w:p>
     <w:p>
@@ -281,94 +1063,48 @@
       </w:r>
       <w:r>
         <w:tab/>
-        <w:t>PSD2/banking connections si no es necesario para el primer vertical slice.</w:t>
-      </w:r>
-    </w:p>
-    <w:p>
-      <w:r>
-        <w:t>1.3 Principios del producto (reglas no negociables)</w:t>
-      </w:r>
-    </w:p>
-    <w:p>
-      <w:r>
-        <w:t>1.</w:t>
-      </w:r>
-      <w:r>
-        <w:tab/>
-        <w:t>Web-first, mobile-perfect.</w:t>
-      </w:r>
-    </w:p>
-    <w:p>
-      <w:r>
-        <w:t>2.</w:t>
-      </w:r>
-      <w:r>
-        <w:tab/>
-        <w:t>Idioma nativo end-to-end (UI + contenido + emails + outputs).</w:t>
-      </w:r>
-    </w:p>
-    <w:p>
-      <w:r>
-        <w:t>3.</w:t>
-      </w:r>
-      <w:r>
-        <w:tab/>
-        <w:t>Gratis = pre-check; pago = ejecución por FinHub (no solo educación).</w:t>
-      </w:r>
-    </w:p>
-    <w:p>
-      <w:r>
-        <w:t>4.</w:t>
-      </w:r>
-      <w:r>
-        <w:tab/>
-        <w:t>Pago antes de trabajo operativo (conversión pre-check → pago como KPI).</w:t>
-      </w:r>
-    </w:p>
-    <w:p>
-      <w:r>
-        <w:t>5.</w:t>
-      </w:r>
-      <w:r>
-        <w:tab/>
-        <w:t>No almacenar credenciales DigiD; operar vía autorización/machtiging (Modo A).</w:t>
-      </w:r>
-    </w:p>
-    <w:p>
-      <w:r>
-        <w:t>6.</w:t>
-      </w:r>
-      <w:r>
-        <w:tab/>
-        <w:t>OCR/IA asistida + revisión humana obligatoria antes de enviar.</w:t>
-      </w:r>
-    </w:p>
-    <w:p>
-      <w:r>
-        <w:t>7.</w:t>
-      </w:r>
-      <w:r>
-        <w:tab/>
-        <w:t>Normativa objetivo 2026 para toeslagen en reglas y copy.</w:t>
+        <w:t>/api/documents/:id/ocr (POST start OCR; GET result)</w:t>
+      </w:r>
+    </w:p>
+    <w:p>
+      <w:r>
+        <w:t>•</w:t>
+      </w:r>
+      <w:r>
+        <w:tab/>
+        <w:t>/api/payments/webhook (Stripe)</w:t>
+      </w:r>
+    </w:p>
+    <w:p>
+      <w:r>
+        <w:t>•</w:t>
+      </w:r>
+      <w:r>
+        <w:tab/>
+        <w:t>/api/authorizations</w:t>
+      </w:r>
+      <w:proofErr w:type="gramStart"/>
+      <w:r>
+        <w:t>/:caseId</w:t>
+      </w:r>
+      <w:proofErr w:type="gramEnd"/>
+      <w:r>
+        <w:t xml:space="preserve"> (POST set method/proof)</w:t>
+      </w:r>
+    </w:p>
+    <w:p>
+      <w:r>
+        <w:t>•</w:t>
+      </w:r>
+      <w:r>
+        <w:tab/>
+        <w:t>/api/admin/cases (operador: cola de revisión)</w:t>
       </w:r>
     </w:p>
     <w:p>
       <w:r>
         <w:lastRenderedPageBreak/>
-        <w:t>8.</w:t>
-      </w:r>
-      <w:r>
-        <w:tab/>
-        <w:t>UI simple, clara, no saturada (“gov-tech moderno”).</w:t>
-      </w:r>
-    </w:p>
-    <w:p>
-      <w:r>
-        <w:t>9.</w:t>
-      </w:r>
-      <w:r>
-        <w:tab/>
-        <w:t>Recomendaciones y ofertas no intrusivas (no spam): siempre con consentimiento, frecuencia controlada y valor real para el usuario (ver §6.7).</w:t>
+        <w:t>Errores estándar: VALIDATION_ERROR, AUTH_REQUIRED, PAYMENT_REQUIRED, AUTHORIZATION_REQUIRED, NOT_FOUND, RATE_LIMITED.</w:t>
       </w:r>
     </w:p>
     <w:p>
@@ -378,70 +1114,180 @@
     </w:p>
     <w:p>
       <w:r>
-        <w:t>2. Reglas y Decisiones Fijas (Fuente de verdad)</w:t>
-      </w:r>
-    </w:p>
-    <w:p>
-      <w:r>
-        <w:t>1.</w:t>
-      </w:r>
-      <w:r>
-        <w:tab/>
-        <w:t>Plataforma v2.0: Web responsive (no app nativa).</w:t>
-      </w:r>
-    </w:p>
-    <w:p>
-      <w:r>
-        <w:t>2.</w:t>
-      </w:r>
-      <w:r>
-        <w:tab/>
-        <w:t>ZZP y BTW fuera de alcance actual.</w:t>
-      </w:r>
-    </w:p>
-    <w:p>
-      <w:r>
-        <w:t>3.</w:t>
-      </w:r>
-      <w:r>
-        <w:tab/>
-        <w:t>Modelo comercial: suscripción + pago por caso.</w:t>
-      </w:r>
-    </w:p>
-    <w:p>
-      <w:r>
-        <w:t>4.</w:t>
-      </w:r>
-      <w:r>
-        <w:tab/>
-        <w:t>Idiomas: ES/PL/RO/EN completos; idioma elegido en landing/perfil.</w:t>
-      </w:r>
-    </w:p>
-    <w:p>
-      <w:r>
-        <w:t>5.</w:t>
-      </w:r>
-      <w:r>
-        <w:tab/>
-        <w:t>Autorizar sin credenciales DigiD: Modo A como estándar (machtigingscode/proof).</w:t>
-      </w:r>
-    </w:p>
-    <w:p>
-      <w:r>
-        <w:t>6.</w:t>
-      </w:r>
-      <w:r>
-        <w:tab/>
-        <w:t>IA/OCR siempre “human-in-the-loop” para documentos y decisiones sensibles.</w:t>
-      </w:r>
-    </w:p>
-    <w:p>
-      <w:r>
-        <w:t>7.</w:t>
-      </w:r>
-      <w:r>
-        <w:tab/>
-        <w:t>Estilo UI: azul oscuro + acento verde; componentes grandes y legibles.</w:t>
+        <w:t>5. UX/UI System (Design tokens + componentes reutilizables)</w:t>
+      </w:r>
+    </w:p>
+    <w:p>
+      <w:r>
+        <w:t>Estado de Fase 2 (UI System básico): CERRADA (20/12/2025).</w:t>
+      </w:r>
+    </w:p>
+    <w:p>
+      <w:r>
+        <w:t>5.1 Tokens (colores, tipografía, spacing, radii) — IMPLEMENTADO</w:t>
+      </w:r>
+    </w:p>
+    <w:p>
+      <w:r>
+        <w:t>•</w:t>
+      </w:r>
+      <w:r>
+        <w:tab/>
+        <w:t>Paleta FinHub: base azul oscuro + acento verde.</w:t>
+      </w:r>
+    </w:p>
+    <w:p>
+      <w:r>
+        <w:t>•</w:t>
+      </w:r>
+      <w:r>
+        <w:tab/>
+        <w:t>Tokens implementados como CSS variables en src/styles/globals.css:</w:t>
+      </w:r>
+    </w:p>
+    <w:p>
+      <w:r>
+        <w:t>o</w:t>
+      </w:r>
+      <w:r>
+        <w:tab/>
+        <w:t>--fh-bg, --fh-surface, --fh-surface-2, --fh-text, --fh-muted, --fh-border, --fh-primary, --fh-primary-fg, --fh-danger, --fh-danger-fg, --fh-focus</w:t>
+      </w:r>
+    </w:p>
+    <w:p>
+      <w:r>
+        <w:t>•</w:t>
+      </w:r>
+      <w:r>
+        <w:tab/>
+        <w:t>Mapeo Tailwind:</w:t>
+      </w:r>
+    </w:p>
+    <w:p>
+      <w:r>
+        <w:t>o</w:t>
+      </w:r>
+      <w:r>
+        <w:tab/>
+        <w:t>colors.</w:t>
+      </w:r>
+      <w:proofErr w:type="gramStart"/>
+      <w:r>
+        <w:t>fh.*</w:t>
+      </w:r>
+      <w:proofErr w:type="gramEnd"/>
+      <w:r>
+        <w:t xml:space="preserve"> en tailwind.config.ts</w:t>
+      </w:r>
+    </w:p>
+    <w:p>
+      <w:r>
+        <w:t>5.2 Componentes base — IMPLEMENTADO (mínimo)</w:t>
+      </w:r>
+    </w:p>
+    <w:p>
+      <w:r>
+        <w:t>Carpeta: src/ui/components/</w:t>
+      </w:r>
+    </w:p>
+    <w:p>
+      <w:r>
+        <w:t>•</w:t>
+      </w:r>
+      <w:r>
+        <w:tab/>
+        <w:t>Screen (layout + container)</w:t>
+      </w:r>
+    </w:p>
+    <w:p>
+      <w:r>
+        <w:t>•</w:t>
+      </w:r>
+      <w:r>
+        <w:tab/>
+        <w:t>Header (título/subtítulo/actions)</w:t>
+      </w:r>
+    </w:p>
+    <w:p>
+      <w:r>
+        <w:t>•</w:t>
+      </w:r>
+      <w:r>
+        <w:tab/>
+        <w:t>Card (surface + border + shadow)</w:t>
+      </w:r>
+    </w:p>
+    <w:p>
+      <w:r>
+        <w:t>•</w:t>
+      </w:r>
+      <w:r>
+        <w:tab/>
+        <w:t>Badge (status)</w:t>
+      </w:r>
+    </w:p>
+    <w:p>
+      <w:r>
+        <w:t>•</w:t>
+      </w:r>
+      <w:r>
+        <w:tab/>
+        <w:t>InfoBox (bloques informativos)</w:t>
+      </w:r>
+    </w:p>
+    <w:p>
+      <w:r>
+        <w:t>Backlog inmediato (se implementará al inicio de Fase 5 para no bloquear):</w:t>
+      </w:r>
+    </w:p>
+    <w:p>
+      <w:r>
+        <w:t>•</w:t>
+      </w:r>
+      <w:r>
+        <w:tab/>
+        <w:t>Button, Input, Select, ToggleGroup, Stepper</w:t>
+      </w:r>
+    </w:p>
+    <w:p>
+      <w:r>
+        <w:t>•</w:t>
+      </w:r>
+      <w:r>
+        <w:tab/>
+        <w:t>DocumentChecklistItem, ReviewSummary</w:t>
+      </w:r>
+    </w:p>
+    <w:p>
+      <w:r>
+        <w:t>5.3 Accesibilidad, i18n y contenido (guidelines)</w:t>
+      </w:r>
+    </w:p>
+    <w:p>
+      <w:r>
+        <w:t>•</w:t>
+      </w:r>
+      <w:r>
+        <w:tab/>
+        <w:t>Tipografía legible, contraste alto, targets táctiles amplios.</w:t>
+      </w:r>
+    </w:p>
+    <w:p>
+      <w:r>
+        <w:t>•</w:t>
+      </w:r>
+      <w:r>
+        <w:tab/>
+        <w:t>i18n: diccionarios por idioma + “content registry” para textos largos (emails/FAQ/landing).</w:t>
+      </w:r>
+    </w:p>
+    <w:p>
+      <w:r>
+        <w:t>•</w:t>
+      </w:r>
+      <w:r>
+        <w:tab/>
+        <w:t>Copy: frases cortas, explicar “qué necesitas y por qué”; holandés solo cuando aporte y con contexto.</w:t>
       </w:r>
     </w:p>
     <w:p>
@@ -451,520 +1297,12 @@
     </w:p>
     <w:p>
       <w:r>
-        <w:t>3. Arquitectura Técnica</w:t>
-      </w:r>
-    </w:p>
-    <w:p>
-      <w:r>
-        <w:t>Estado de Fase 3 (Arquitectura): CERRADA (19/12/2025).</w:t>
-      </w:r>
-    </w:p>
-    <w:p>
-      <w:r>
-        <w:t>Decisión: Web-first; stack objetivo; autorización Modo A como estándar.</w:t>
-      </w:r>
-    </w:p>
-    <w:p>
-      <w:r>
-        <w:t>3.1 Stack (objetivo v1 web)</w:t>
-      </w:r>
-    </w:p>
-    <w:p>
-      <w:r>
-        <w:t>•</w:t>
-      </w:r>
-      <w:r>
-        <w:tab/>
-        <w:t>Frontend: Next.js (App Router) + TypeScript + Tailwind v4.</w:t>
-      </w:r>
-    </w:p>
-    <w:p>
-      <w:r>
-        <w:t>•</w:t>
-      </w:r>
-      <w:r>
-        <w:tab/>
-        <w:t>Backend/DB/Auth/Storage (objetivo): Supabase (PostgreSQL + Auth + Storage + RLS; Edge Functions opcional).</w:t>
-      </w:r>
-    </w:p>
-    <w:p>
-      <w:r>
-        <w:t>•</w:t>
-      </w:r>
-      <w:r>
-        <w:tab/>
-        <w:t>Pagos: Stripe (suscripción + pago por caso + webhooks).</w:t>
-      </w:r>
-    </w:p>
-    <w:p>
-      <w:r>
-        <w:t>•</w:t>
-      </w:r>
-      <w:r>
-        <w:tab/>
-        <w:t>OCR: Azure AI Document Intelligence + editor manual + auditoría.</w:t>
-      </w:r>
-    </w:p>
-    <w:p>
-      <w:r>
-        <w:t>•</w:t>
-      </w:r>
-      <w:r>
-        <w:tab/>
-        <w:t>Observabilidad: Sentry (frontend) + logging estructurado (server) + auditoría de eventos en DB.</w:t>
-      </w:r>
-    </w:p>
-    <w:p>
-      <w:r>
-        <w:t>Nota: el repo actual ya está en Next/TS/Tailwind v4. shadcn/ui queda como opcional; el UI kit mínimo existe en src/ui.</w:t>
-      </w:r>
-    </w:p>
-    <w:p>
-      <w:r>
-        <w:t>3.2 Estructura de proyecto (carpetas y convenciones) — ACTUALIZADA</w:t>
-      </w:r>
-    </w:p>
-    <w:p>
-      <w:r>
-        <w:t>Árbol actual confirmado (post-Fase 5):</w:t>
-      </w:r>
-    </w:p>
-    <w:p>
-      <w:r>
-        <w:t>•</w:t>
-      </w:r>
-      <w:r>
-        <w:tab/>
-        <w:t>src/</w:t>
-      </w:r>
-    </w:p>
-    <w:p>
-      <w:r>
-        <w:t>o</w:t>
-      </w:r>
-      <w:r>
-        <w:tab/>
-        <w:t xml:space="preserve">  app/</w:t>
-      </w:r>
-    </w:p>
-    <w:p>
-      <w:r>
-        <w:lastRenderedPageBreak/>
-        <w:t></w:t>
-      </w:r>
-      <w:r>
-        <w:tab/>
-        <w:t xml:space="preserve">    layout.tsx</w:t>
-      </w:r>
-    </w:p>
-    <w:p>
-      <w:r>
-        <w:t></w:t>
-      </w:r>
-      <w:r>
-        <w:tab/>
-        <w:t xml:space="preserve">    page.tsx (redirect / → /landing)</w:t>
-      </w:r>
-    </w:p>
-    <w:p>
-      <w:r>
-        <w:t></w:t>
-      </w:r>
-      <w:r>
-        <w:tab/>
-        <w:t xml:space="preserve">    (auth)/login/page.tsx</w:t>
-      </w:r>
-    </w:p>
-    <w:p>
-      <w:r>
-        <w:t></w:t>
-      </w:r>
-      <w:r>
-        <w:tab/>
-        <w:t xml:space="preserve">    (marketing)/landing/page.tsx (placeholder; se convertirá en landing profesional)</w:t>
-      </w:r>
-    </w:p>
-    <w:p>
-      <w:r>
-        <w:t></w:t>
-      </w:r>
-      <w:r>
-        <w:tab/>
-        <w:t xml:space="preserve">    (dashboard)/app/</w:t>
-      </w:r>
-    </w:p>
-    <w:p>
-      <w:r>
-        <w:t></w:t>
-      </w:r>
-      <w:r>
-        <w:tab/>
-        <w:t xml:space="preserve">      layout.tsx (shell privado + route guard stub)</w:t>
-      </w:r>
-    </w:p>
-    <w:p>
-      <w:r>
-        <w:t></w:t>
-      </w:r>
-      <w:r>
-        <w:tab/>
-        <w:t xml:space="preserve">      providers.tsx (AppProviders)</w:t>
-      </w:r>
-    </w:p>
-    <w:p>
-      <w:r>
-        <w:t></w:t>
-      </w:r>
-      <w:r>
-        <w:tab/>
-        <w:t xml:space="preserve">      page.tsx (home privado placeholder usando UI kit)</w:t>
-      </w:r>
-    </w:p>
-    <w:p>
-      <w:r>
-        <w:t></w:t>
-      </w:r>
-      <w:r>
-        <w:tab/>
-        <w:t xml:space="preserve">      cases/</w:t>
-      </w:r>
-    </w:p>
-    <w:p>
-      <w:r>
-        <w:t></w:t>
-      </w:r>
-      <w:r>
-        <w:tab/>
-        <w:t xml:space="preserve">        page.tsx</w:t>
-      </w:r>
-    </w:p>
-    <w:p>
-      <w:r>
-        <w:t>o</w:t>
-      </w:r>
-      <w:r>
-        <w:tab/>
-        <w:t xml:space="preserve">        ui/CasesListClient.tsx</w:t>
-      </w:r>
-    </w:p>
-    <w:p>
-      <w:r>
-        <w:t xml:space="preserve">        new/</w:t>
-      </w:r>
-    </w:p>
-    <w:p>
-      <w:r>
-        <w:t xml:space="preserve">          page.tsx</w:t>
-      </w:r>
-    </w:p>
-    <w:p>
-      <w:r>
-        <w:t xml:space="preserve">          ui/NewCaseClient.tsx</w:t>
-      </w:r>
-    </w:p>
-    <w:p>
-      <w:r>
-        <w:t xml:space="preserve">        [id]/</w:t>
-      </w:r>
-    </w:p>
-    <w:p>
-      <w:r>
-        <w:t xml:space="preserve">          page.tsx</w:t>
-      </w:r>
-    </w:p>
-    <w:p>
-      <w:r>
-        <w:t xml:space="preserve">          ui/CaseOverviewClient.tsx</w:t>
-      </w:r>
-    </w:p>
-    <w:p>
-      <w:r>
-        <w:t xml:space="preserve">          [stepKey]/</w:t>
-      </w:r>
-    </w:p>
-    <w:p>
-      <w:r>
-        <w:t xml:space="preserve">            page.tsx</w:t>
-      </w:r>
-    </w:p>
-    <w:p>
-      <w:r>
-        <w:t xml:space="preserve">            ui/StepClient.tsx</w:t>
-      </w:r>
-    </w:p>
-    <w:p>
-      <w:r>
-        <w:t xml:space="preserve">      documents/</w:t>
-      </w:r>
-    </w:p>
-    <w:p>
-      <w:r>
-        <w:t xml:space="preserve">        page.tsx</w:t>
-      </w:r>
-    </w:p>
-    <w:p>
-      <w:r>
-        <w:t xml:space="preserve">        ui/DocumentsClient.tsx</w:t>
-      </w:r>
-    </w:p>
-    <w:p>
-      <w:r>
-        <w:t xml:space="preserve">      profile/page.tsx</w:t>
-      </w:r>
-    </w:p>
-    <w:p>
-      <w:r>
-        <w:t xml:space="preserve">      ui-kit/page.tsx</w:t>
-      </w:r>
-    </w:p>
-    <w:p>
-      <w:r>
-        <w:t xml:space="preserve">  features/</w:t>
-      </w:r>
-    </w:p>
-    <w:p>
-      <w:r>
-        <w:t xml:space="preserve">    cases/ (Case Engine v1: tipos + config + storage + store)</w:t>
-      </w:r>
-    </w:p>
-    <w:p>
-      <w:r>
-        <w:t xml:space="preserve">    documents/ (Document Vault v1: tipos + storage + store)</w:t>
-      </w:r>
-    </w:p>
-    <w:p>
-      <w:r>
-        <w:t>o</w:t>
-      </w:r>
-      <w:r>
-        <w:tab/>
-        <w:t>ui/</w:t>
-      </w:r>
-    </w:p>
-    <w:p>
-      <w:r>
-        <w:lastRenderedPageBreak/>
-        <w:t></w:t>
-      </w:r>
-      <w:r>
-        <w:tab/>
-        <w:t>cn.ts</w:t>
-      </w:r>
-    </w:p>
-    <w:p>
-      <w:r>
-        <w:t></w:t>
-      </w:r>
-      <w:r>
-        <w:tab/>
-        <w:t>components/</w:t>
-      </w:r>
-    </w:p>
-    <w:p>
-      <w:r>
-        <w:t></w:t>
-      </w:r>
-      <w:r>
-        <w:tab/>
-        <w:t>Screen.tsx</w:t>
-      </w:r>
-    </w:p>
-    <w:p>
-      <w:r>
-        <w:t></w:t>
-      </w:r>
-      <w:r>
-        <w:tab/>
-        <w:t>Header.tsx</w:t>
-      </w:r>
-    </w:p>
-    <w:p>
-      <w:r>
-        <w:t></w:t>
-      </w:r>
-      <w:r>
-        <w:tab/>
-        <w:t>Card.tsx</w:t>
-      </w:r>
-    </w:p>
-    <w:p>
-      <w:r>
-        <w:t></w:t>
-      </w:r>
-      <w:r>
-        <w:tab/>
-        <w:t>Badge.tsx</w:t>
-      </w:r>
-    </w:p>
-    <w:p>
-      <w:r>
-        <w:t></w:t>
-      </w:r>
-      <w:r>
-        <w:tab/>
-        <w:t>InfoBox.tsx</w:t>
-      </w:r>
-    </w:p>
-    <w:p>
-      <w:r>
-        <w:t>o</w:t>
-      </w:r>
-      <w:r>
-        <w:tab/>
-        <w:t>features/README.md</w:t>
-      </w:r>
-    </w:p>
-    <w:p>
-      <w:r>
-        <w:t>o</w:t>
-      </w:r>
-      <w:r>
-        <w:tab/>
-        <w:t>__tests__/smoke.test.ts</w:t>
-      </w:r>
-    </w:p>
-    <w:p>
-      <w:r>
-        <w:t>Raíces/config:</w:t>
-      </w:r>
-    </w:p>
-    <w:p>
-      <w:r>
-        <w:t>•</w:t>
-      </w:r>
-      <w:r>
-        <w:tab/>
-        <w:t>tailwind.config.ts (mapeo a tokens fh.*)</w:t>
-      </w:r>
-    </w:p>
-    <w:p>
-      <w:r>
-        <w:t>•</w:t>
-      </w:r>
-      <w:r>
-        <w:tab/>
-        <w:t>postcss.config.mjs (Tailwind v4 PostCSS plugin)</w:t>
-      </w:r>
-    </w:p>
-    <w:p>
-      <w:r>
-        <w:t>•</w:t>
-      </w:r>
-      <w:r>
-        <w:tab/>
-        <w:t>package.json (Next 16.1.0, React 19.x)</w:t>
-      </w:r>
-    </w:p>
-    <w:p>
-      <w:r>
-        <w:t>3.3 Rutas v1 (mínimas)</w:t>
-      </w:r>
-    </w:p>
-    <w:p>
-      <w:r>
-        <w:t>•</w:t>
-      </w:r>
-      <w:r>
-        <w:tab/>
-        <w:t>Público:</w:t>
-      </w:r>
-    </w:p>
-    <w:p>
-      <w:r>
-        <w:t>o</w:t>
-      </w:r>
-      <w:r>
-        <w:tab/>
-        <w:t>/landing</w:t>
-      </w:r>
-    </w:p>
-    <w:p>
-      <w:r>
-        <w:t>o</w:t>
-      </w:r>
-      <w:r>
-        <w:tab/>
-        <w:t>/login</w:t>
-      </w:r>
-    </w:p>
-    <w:p>
-      <w:r>
-        <w:t>•</w:t>
-      </w:r>
-      <w:r>
-        <w:tab/>
-        <w:t>Privado:</w:t>
-      </w:r>
-    </w:p>
-    <w:p>
-      <w:r>
-        <w:t>o</w:t>
-      </w:r>
-      <w:r>
-        <w:tab/>
-        <w:t>/app</w:t>
-      </w:r>
-    </w:p>
-    <w:p>
-      <w:r>
-        <w:t>o</w:t>
-      </w:r>
-      <w:r>
-        <w:tab/>
-        <w:t>/app/cases</w:t>
-      </w:r>
-    </w:p>
-    <w:p>
-      <w:r>
-        <w:t>o</w:t>
-      </w:r>
-      <w:r>
-        <w:tab/>
-        <w:t>/app/cases/new</w:t>
-      </w:r>
-    </w:p>
-    <w:p>
-      <w:r>
-        <w:t>o</w:t>
-      </w:r>
-      <w:r>
-        <w:tab/>
-        <w:t>/app/cases/:id</w:t>
-      </w:r>
-    </w:p>
-    <w:p>
-      <w:r>
-        <w:t>/app/cases/:id/:stepKey</w:t>
-      </w:r>
-    </w:p>
-    <w:p>
-      <w:r>
-        <w:t>/app/documents</w:t>
-      </w:r>
-    </w:p>
-    <w:p>
-      <w:r>
-        <w:t>/app/profile</w:t>
-      </w:r>
-    </w:p>
-    <w:p>
-      <w:r>
-        <w:t>/app/ui-kit</w:t>
-      </w:r>
-    </w:p>
-    <w:p>
-      <w:r>
-        <w:t>________________________________________</w:t>
-      </w:r>
-    </w:p>
-    <w:p>
-      <w:r>
-        <w:t>4. Contratos y API (visión, aún no implementado)</w:t>
-      </w:r>
-    </w:p>
-    <w:p>
-      <w:r>
-        <w:t>Endpoints objetivo (alto nivel):</w:t>
+        <w:t>6. Módulos y Flujos Funcionales (detalle por módulo)</w:t>
+      </w:r>
+    </w:p>
+    <w:p>
+      <w:r>
+        <w:t>6.1 Plataforma Core (Auth, Perfil, Shell)</w:t>
       </w:r>
     </w:p>
     <w:p>
@@ -974,7 +1312,7 @@
       </w:r>
       <w:r>
         <w:tab/>
-        <w:t>/api/cases (POST create)</w:t>
+        <w:t>Propósito: acceso, idioma, navegación clara, base de casos.</w:t>
       </w:r>
     </w:p>
     <w:p>
@@ -983,7 +1321,7 @@
       </w:r>
       <w:r>
         <w:tab/>
-        <w:t>/api/cases/:id (GET)</w:t>
+        <w:t>Pantallas mínimas: Landing → Login → Dashboard Home → Profile.</w:t>
       </w:r>
     </w:p>
     <w:p>
@@ -992,275 +1330,42 @@
       </w:r>
       <w:r>
         <w:tab/>
-        <w:t>/api/cases/:id/steps/:stepKey (PUT save step)</w:t>
-      </w:r>
-    </w:p>
-    <w:p>
-      <w:r>
-        <w:t>•</w:t>
-      </w:r>
-      <w:r>
-        <w:tab/>
-        <w:t>/api/cases/:id/documents (POST upload metadata)</w:t>
-      </w:r>
-    </w:p>
-    <w:p>
-      <w:r>
-        <w:t>•</w:t>
-      </w:r>
-      <w:r>
-        <w:tab/>
-        <w:t>/api/documents/:id/ocr (POST start OCR; GET result)</w:t>
-      </w:r>
-    </w:p>
-    <w:p>
-      <w:r>
-        <w:t>•</w:t>
-      </w:r>
-      <w:r>
-        <w:tab/>
-        <w:t>/api/payments/webhook (Stripe)</w:t>
-      </w:r>
-    </w:p>
-    <w:p>
-      <w:r>
-        <w:t>•</w:t>
-      </w:r>
-      <w:r>
-        <w:tab/>
-        <w:t>/api/authorizations/:caseId (POST set method/proof)</w:t>
-      </w:r>
-    </w:p>
-    <w:p>
-      <w:r>
-        <w:t>•</w:t>
-      </w:r>
-      <w:r>
-        <w:tab/>
-        <w:t>/api/admin/cases (operador: cola de revisión)</w:t>
-      </w:r>
-    </w:p>
-    <w:p>
-      <w:r>
-        <w:t>Errores estándar: VALIDATION_ERROR, AUTH_REQUIRED, PAYMENT_REQUIRED, AUTHORIZATION_REQUIRED, NOT_FOUND, RATE_LIMITED.</w:t>
-      </w:r>
-    </w:p>
-    <w:p>
-      <w:r>
-        <w:t>________________________________________</w:t>
-      </w:r>
-    </w:p>
-    <w:p>
-      <w:r>
-        <w:t>5. UX/UI System (Design tokens + componentes reutilizables)</w:t>
-      </w:r>
-    </w:p>
-    <w:p>
-      <w:r>
-        <w:t>Estado de Fase 2 (UI System básico): CERRADA (20/12/2025).</w:t>
-      </w:r>
-    </w:p>
-    <w:p>
-      <w:r>
-        <w:t>5.1 Tokens (colores, tipografía, spacing, radii) — IMPLEMENTADO</w:t>
-      </w:r>
-    </w:p>
-    <w:p>
-      <w:r>
-        <w:t>•</w:t>
-      </w:r>
-      <w:r>
-        <w:tab/>
-        <w:t>Paleta FinHub: base azul oscuro + acento verde.</w:t>
-      </w:r>
-    </w:p>
-    <w:p>
-      <w:r>
-        <w:t>•</w:t>
-      </w:r>
-      <w:r>
-        <w:tab/>
-        <w:t>Tokens implementados como CSS variables en src/styles/globals.css:</w:t>
-      </w:r>
-    </w:p>
-    <w:p>
-      <w:r>
-        <w:t>o</w:t>
-      </w:r>
-      <w:r>
-        <w:tab/>
-        <w:t>--fh-bg, --fh-surface, --fh-surface-2, --fh-text, --fh-muted, --fh-border, --fh-primary, --fh-primary-fg, --fh-danger, --fh-danger-fg, --fh-focus</w:t>
-      </w:r>
-    </w:p>
-    <w:p>
-      <w:r>
-        <w:t>•</w:t>
-      </w:r>
-      <w:r>
-        <w:tab/>
-        <w:t>Mapeo Tailwind:</w:t>
-      </w:r>
-    </w:p>
-    <w:p>
-      <w:r>
-        <w:t>o</w:t>
-      </w:r>
-      <w:r>
-        <w:tab/>
-        <w:t>colors.fh.* en tailwind.config.ts</w:t>
-      </w:r>
-    </w:p>
-    <w:p>
-      <w:r>
-        <w:t>5.2 Componentes base — IMPLEMENTADO (mínimo)</w:t>
-      </w:r>
-    </w:p>
-    <w:p>
-      <w:r>
-        <w:t>Carpeta: src/ui/components/</w:t>
-      </w:r>
-    </w:p>
-    <w:p>
-      <w:r>
-        <w:t>•</w:t>
-      </w:r>
-      <w:r>
-        <w:tab/>
-        <w:t>Screen (layout + container)</w:t>
-      </w:r>
-    </w:p>
-    <w:p>
-      <w:r>
-        <w:t>•</w:t>
-      </w:r>
-      <w:r>
-        <w:tab/>
-        <w:t>Header (título/subtítulo/actions)</w:t>
-      </w:r>
-    </w:p>
-    <w:p>
-      <w:r>
-        <w:t>•</w:t>
-      </w:r>
-      <w:r>
-        <w:tab/>
-        <w:t>Card (surface + border + shadow)</w:t>
-      </w:r>
-    </w:p>
-    <w:p>
-      <w:r>
-        <w:t>•</w:t>
-      </w:r>
-      <w:r>
-        <w:tab/>
-        <w:t>Badge (status)</w:t>
-      </w:r>
-    </w:p>
-    <w:p>
-      <w:r>
-        <w:t>•</w:t>
-      </w:r>
-      <w:r>
-        <w:tab/>
-        <w:t>InfoBox (bloques informativos)</w:t>
-      </w:r>
-    </w:p>
-    <w:p>
-      <w:r>
-        <w:t>Backlog inmediato (se implementará al inicio de Fase 5 para no bloquear):</w:t>
-      </w:r>
-    </w:p>
-    <w:p>
-      <w:r>
-        <w:t>•</w:t>
-      </w:r>
-      <w:r>
-        <w:tab/>
-        <w:t>Button, Input, Select, ToggleGroup, Stepper</w:t>
-      </w:r>
-    </w:p>
-    <w:p>
-      <w:r>
-        <w:t>•</w:t>
-      </w:r>
-      <w:r>
-        <w:tab/>
-        <w:t>DocumentChecklistItem, ReviewSummary</w:t>
-      </w:r>
-    </w:p>
-    <w:p>
-      <w:r>
-        <w:lastRenderedPageBreak/>
-        <w:t>5.3 Accesibilidad, i18n y contenido (guidelines)</w:t>
-      </w:r>
-    </w:p>
-    <w:p>
-      <w:r>
-        <w:t>•</w:t>
-      </w:r>
-      <w:r>
-        <w:tab/>
-        <w:t>Tipografía legible, contraste alto, targets táctiles amplios.</w:t>
-      </w:r>
-    </w:p>
-    <w:p>
-      <w:r>
-        <w:t>•</w:t>
-      </w:r>
-      <w:r>
-        <w:tab/>
-        <w:t>i18n: diccionarios por idioma + “content registry” para textos largos (emails/FAQ/landing).</w:t>
-      </w:r>
-    </w:p>
-    <w:p>
-      <w:r>
-        <w:t>•</w:t>
-      </w:r>
-      <w:r>
-        <w:tab/>
-        <w:t>Copy: frases cortas, explicar “qué necesitas y por qué”; holandés solo cuando aporte y con contexto.</w:t>
-      </w:r>
-    </w:p>
-    <w:p>
-      <w:r>
-        <w:t>________________________________________</w:t>
-      </w:r>
-    </w:p>
-    <w:p>
-      <w:r>
-        <w:t>6. Módulos y Flujos Funcionales (detalle por módulo)</w:t>
-      </w:r>
-    </w:p>
-    <w:p>
-      <w:r>
-        <w:t>6.1 Plataforma Core (Auth, Perfil, Shell)</w:t>
-      </w:r>
-    </w:p>
-    <w:p>
-      <w:r>
-        <w:t>•</w:t>
-      </w:r>
-      <w:r>
-        <w:tab/>
-        <w:t>Propósito: acceso, idioma, navegación clara, base de casos.</w:t>
-      </w:r>
-    </w:p>
-    <w:p>
-      <w:r>
-        <w:t>•</w:t>
-      </w:r>
-      <w:r>
-        <w:tab/>
-        <w:t>Pantallas mínimas: Landing → Login → Dashboard Home → Profile.</w:t>
-      </w:r>
-    </w:p>
-    <w:p>
-      <w:r>
-        <w:t>•</w:t>
-      </w:r>
-      <w:r>
-        <w:tab/>
         <w:t>DoD: protección de rutas (auth), perfil básico (idioma + datos mínimos), shell consistente.</w:t>
+      </w:r>
+    </w:p>
+    <w:p>
+      <w:r>
+        <w:t>Backlog Auth “pro” (se implementará después del cierre de Fase 4):</w:t>
+      </w:r>
+    </w:p>
+    <w:p>
+      <w:r>
+        <w:t>• OAuth (Google) y opcional Apple (si aplica).</w:t>
+      </w:r>
+    </w:p>
+    <w:p>
+      <w:r>
+        <w:t>• Política de contraseña: mínimo de caracteres, complejidad (caracteres especiales) y feedback de validación en UI.</w:t>
+      </w:r>
+    </w:p>
+    <w:p>
+      <w:r>
+        <w:t>• Confirmación de email (activar en prod) + reenvío de confirmación + recuperación de contraseña.</w:t>
+      </w:r>
+    </w:p>
+    <w:p>
+      <w:r>
+        <w:t>• MFA/2FA opcional (según tier premium y requisitos GDPR).</w:t>
+      </w:r>
+    </w:p>
+    <w:p>
+      <w:r>
+        <w:t>• Rate limiting / protección anti-abuso (especialmente en endpoints de auth).</w:t>
+      </w:r>
+    </w:p>
+    <w:p>
+      <w:r>
+        <w:t>• Auditoría: tracking de eventos de auth (login, logout, reset) y alertas básicas.</w:t>
       </w:r>
     </w:p>
     <w:p>
@@ -1643,7 +1748,14 @@
       </w:r>
       <w:r>
         <w:tab/>
-        <w:t>Repo + estándares + CI</w:t>
+      </w:r>
+      <w:proofErr w:type="gramStart"/>
+      <w:r>
+        <w:t>Repo</w:t>
+      </w:r>
+      <w:proofErr w:type="gramEnd"/>
+      <w:r>
+        <w:t xml:space="preserve"> + estándares + CI</w:t>
       </w:r>
       <w:r>
         <w:tab/>
@@ -1660,7 +1772,14 @@
       </w:r>
       <w:r>
         <w:tab/>
-        <w:t>Descubrimiento/Canon</w:t>
+      </w:r>
+      <w:proofErr w:type="gramStart"/>
+      <w:r>
+        <w:t>Descubrimiento</w:t>
+      </w:r>
+      <w:proofErr w:type="gramEnd"/>
+      <w:r>
+        <w:t>/Canon</w:t>
       </w:r>
       <w:r>
         <w:tab/>
@@ -1694,7 +1813,14 @@
       </w:r>
       <w:r>
         <w:tab/>
-        <w:t>Arquitectura técnica</w:t>
+      </w:r>
+      <w:proofErr w:type="gramStart"/>
+      <w:r>
+        <w:t>Arquitectura</w:t>
+      </w:r>
+      <w:proofErr w:type="gramEnd"/>
+      <w:r>
+        <w:t xml:space="preserve"> técnica</w:t>
       </w:r>
       <w:r>
         <w:tab/>
@@ -1711,7 +1837,14 @@
       </w:r>
       <w:r>
         <w:tab/>
-        <w:t>Modelo de datos + contratos</w:t>
+      </w:r>
+      <w:proofErr w:type="gramStart"/>
+      <w:r>
+        <w:t>Modelo</w:t>
+      </w:r>
+      <w:proofErr w:type="gramEnd"/>
+      <w:r>
+        <w:t xml:space="preserve"> de datos + contratos</w:t>
       </w:r>
       <w:r>
         <w:tab/>
@@ -1796,8 +1929,12 @@
       </w:r>
       <w:r>
         <w:tab/>
+      </w:r>
+      <w:proofErr w:type="gramStart"/>
+      <w:r>
         <w:t>Operación</w:t>
       </w:r>
+      <w:proofErr w:type="gramEnd"/>
       <w:r>
         <w:tab/>
         <w:t>monitoring + soporte + mejoras</w:t>
@@ -1911,7 +2048,15 @@
       </w:r>
       <w:r>
         <w:tab/>
-        <w:t>tailwind.config.ts (mapeo a tokens fh.*)</w:t>
+        <w:t xml:space="preserve">tailwind.config.ts (mapeo a tokens </w:t>
+      </w:r>
+      <w:proofErr w:type="gramStart"/>
+      <w:r>
+        <w:t>fh.*</w:t>
+      </w:r>
+      <w:proofErr w:type="gramEnd"/>
+      <w:r>
+        <w:t>)</w:t>
       </w:r>
     </w:p>
     <w:p>
@@ -1991,17 +2136,17 @@
     </w:p>
     <w:p>
       <w:r>
-        <w:t>- src/app/(auth)/login/page.tsx (login stub con server action que crea cookie fh_session)</w:t>
-      </w:r>
-    </w:p>
-    <w:p>
-      <w:r>
-        <w:t>- src/app/(dashboard)/app/layout.tsx (shell + protección stub por cookie + logout)</w:t>
-      </w:r>
-    </w:p>
-    <w:p>
-      <w:r>
-        <w:t>- src/app/(dashboard)/app/providers.tsx (AppProviders con providers de features)</w:t>
+        <w:t>- src/app/(auth)/login/page.tsx (Login con Supabase Auth email/password; crea sesión de usuario y redirige a /app).</w:t>
+      </w:r>
+    </w:p>
+    <w:p>
+      <w:r>
+        <w:t>- src/app/(dashboard)/app/layout.tsx (Shell del dashboard + protección de rutas /app basada en sesión; logout).</w:t>
+      </w:r>
+    </w:p>
+    <w:p>
+      <w:r>
+        <w:t>- src/app/(dashboard)/app/providers.tsx (AppProviders: providers de Cases + Documents).</w:t>
       </w:r>
     </w:p>
     <w:p>
@@ -2046,7 +2191,8 @@
     </w:p>
     <w:p>
       <w:r>
-        <w:t>- Persistencia local: localStorage (v1) con estructura por Case/Step/Document.</w:t>
+        <w:lastRenderedPageBreak/>
+        <w:t>- Persistencia: Supabase (tabla cases + drafts locales por step en caseDraftsStore; Document Vault base en Supabase/Storage).</w:t>
       </w:r>
     </w:p>
     <w:p>
@@ -2056,8 +2202,203 @@
     </w:p>
     <w:p>
       <w:r>
+        <w:t>Cierre cosmético (DONE):</w:t>
+      </w:r>
+    </w:p>
+    <w:p>
+      <w:r>
+        <w:t>•</w:t>
+      </w:r>
+      <w:r>
+        <w:tab/>
+        <w:t>src/app/page.tsx: redirección / → /landing (implementado).</w:t>
+      </w:r>
+    </w:p>
+    <w:p>
+      <w:r>
+        <w:t>8.3 Cambios realizados en Fase 4 (registro de implementación)</w:t>
+      </w:r>
+    </w:p>
+    <w:p>
+      <w:r>
+        <w:t>Rama: phase-4-data-contracts (base: phase-5-frontend-core). Commit: (no registrado en este documento).</w:t>
+      </w:r>
+    </w:p>
+    <w:p>
+      <w:r>
+        <w:t>Entregables Fase 4 (DoD): OpenAPI v1 + schema SQL (migrations) + RLS completa + mapping estable desde stores del frontend a DB (Supabase). Estado: en curso; existe ya esquema mínimo para cases/documents.</w:t>
+      </w:r>
+    </w:p>
+    <w:p>
+      <w:r>
+        <w:t>Archivos creados/confirmados (docs/):</w:t>
+      </w:r>
+    </w:p>
+    <w:p>
+      <w:r>
+        <w:t>•</w:t>
+      </w:r>
+      <w:r>
+        <w:tab/>
+        <w:t>docs/README.md</w:t>
+      </w:r>
+    </w:p>
+    <w:p>
+      <w:r>
+        <w:t>•</w:t>
+      </w:r>
+      <w:r>
+        <w:tab/>
+        <w:t>docs/domain/scope-v1.md</w:t>
+      </w:r>
+    </w:p>
+    <w:p>
+      <w:r>
+        <w:t>•</w:t>
+      </w:r>
+      <w:r>
+        <w:tab/>
+        <w:t>docs/domain/model-v1.md</w:t>
+      </w:r>
+    </w:p>
+    <w:p>
+      <w:r>
+        <w:t>•</w:t>
+      </w:r>
+      <w:r>
+        <w:tab/>
+        <w:t>docs/domain/mapping-localstorage-to-db.md</w:t>
+      </w:r>
+    </w:p>
+    <w:p>
+      <w:r>
+        <w:t>•</w:t>
+      </w:r>
+      <w:r>
+        <w:tab/>
+        <w:t>docs/openapi/finhub-v1.yaml</w:t>
+      </w:r>
+    </w:p>
+    <w:p>
+      <w:r>
+        <w:t>•</w:t>
+      </w:r>
+      <w:r>
+        <w:tab/>
+        <w:t>docs/db/schema-v1.sql</w:t>
+      </w:r>
+    </w:p>
+    <w:p>
+      <w:r>
+        <w:t>•</w:t>
+      </w:r>
+      <w:r>
+        <w:tab/>
+        <w:t>docs/db/rls-v1.md</w:t>
+      </w:r>
+    </w:p>
+    <w:p>
+      <w:r>
+        <w:t>•</w:t>
+      </w:r>
+      <w:r>
+        <w:tab/>
+        <w:t>docs/phase-4-closure.md</w:t>
+      </w:r>
+    </w:p>
+    <w:p>
+      <w:r>
+        <w:t>Datos clave extraídos del código (fuente de verdad frontend):</w:t>
+      </w:r>
+    </w:p>
+    <w:p>
+      <w:r>
+        <w:t>•</w:t>
+      </w:r>
+      <w:r>
+        <w:tab/>
+        <w:t>localStorage keys: fh_cases_state_v1, fh_documents_state_v1.</w:t>
+      </w:r>
+    </w:p>
+    <w:p>
+      <w:r>
+        <w:t>•</w:t>
+      </w:r>
+      <w:r>
+        <w:tab/>
+        <w:t>CaseType: toeslag_huur | toeslag_zorg | toeslag_kinderopvang | tax_ib | tax_voorlopige_aanslag | finances_intake | document_review.</w:t>
+      </w:r>
+    </w:p>
+    <w:p>
+      <w:r>
+        <w:t>•</w:t>
+      </w:r>
+      <w:r>
+        <w:tab/>
+        <w:t>CaseStatus: created | in_progress | waiting_user | submitted | under_review | completed | cancelled.</w:t>
+      </w:r>
+    </w:p>
+    <w:p>
+      <w:r>
+        <w:t>•</w:t>
+      </w:r>
+      <w:r>
+        <w:tab/>
+        <w:t>StepKey: eligibility | result | checkout | authorization | documents | review | intake | submission | done.</w:t>
+      </w:r>
+    </w:p>
+    <w:p>
+      <w:r>
+        <w:t>•</w:t>
+      </w:r>
+      <w:r>
+        <w:tab/>
+        <w:t>DocumentType: id | income | bank | rental | tax | other. DocumentStatus: pending | ready | reviewed.</w:t>
+      </w:r>
+    </w:p>
+    <w:p>
+      <w:r>
+        <w:t>•</w:t>
+      </w:r>
+      <w:r>
+        <w:tab/>
+        <w:t>Definición de pasos por tipo (casesConfig.ts):</w:t>
+      </w:r>
+    </w:p>
+    <w:p>
+      <w:r>
+        <w:t xml:space="preserve">  - Toeslagen: eligibility → result → checkout → authorization → documents → review.</w:t>
+      </w:r>
+    </w:p>
+    <w:p>
+      <w:r>
         <w:lastRenderedPageBreak/>
-        <w:t>Cierre cosmético (DONE):</w:t>
+        <w:t xml:space="preserve">  - Taxes: intake → documents → review → submission → done.</w:t>
+      </w:r>
+    </w:p>
+    <w:p>
+      <w:r>
+        <w:t xml:space="preserve">  - Finances/document_review: intake → documents → review → done.</w:t>
+      </w:r>
+    </w:p>
+    <w:p>
+      <w:r>
+        <w:t>Nota técnica: corregir encoding de 'Revisión de documentos' (actualmente aparece como 'RevisiÃ³n de documentos' en defaultTitleForCaseType).</w:t>
+      </w:r>
+    </w:p>
+    <w:p>
+      <w:r>
+        <w:t>________________________________________</w:t>
+      </w:r>
+    </w:p>
+    <w:p>
+      <w:r>
+        <w:t>9. Landing (marketing) — DIRECTIVA ACTUALIZADA</w:t>
+      </w:r>
+    </w:p>
+    <w:p>
+      <w:r>
+        <w:t>El landing actual es placeholder. Se construirá un landing profesional, llamativo y orientado a conversión, que:</w:t>
       </w:r>
     </w:p>
     <w:p>
@@ -2066,7 +2407,52 @@
       </w:r>
       <w:r>
         <w:tab/>
-        <w:t>src/app/page.tsx: redirección / → /landing (implementado).</w:t>
+        <w:t>Explique claramente qué es FinHub y qué resuelve.</w:t>
+      </w:r>
+    </w:p>
+    <w:p>
+      <w:r>
+        <w:t>•</w:t>
+      </w:r>
+      <w:r>
+        <w:tab/>
+        <w:t>Muestre el flujo “pre-check gratis → pago → gestión completa con revisión humana”.</w:t>
+      </w:r>
+    </w:p>
+    <w:p>
+      <w:r>
+        <w:t>•</w:t>
+      </w:r>
+      <w:r>
+        <w:tab/>
+        <w:t>Destaque confianza (seguridad, no credenciales DigiD, cumplimiento/GDPR).</w:t>
+      </w:r>
+    </w:p>
+    <w:p>
+      <w:r>
+        <w:t>•</w:t>
+      </w:r>
+      <w:r>
+        <w:tab/>
+        <w:t>Incentive a continuar con CTA claras (“Empezar pre-check”, “Ver cómo funciona”, “Iniciar sesión”).</w:t>
+      </w:r>
+    </w:p>
+    <w:p>
+      <w:r>
+        <w:t>•</w:t>
+      </w:r>
+      <w:r>
+        <w:tab/>
+        <w:t>Soporte i18n (ES/PL/RO/EN) con selector discreto.</w:t>
+      </w:r>
+    </w:p>
+    <w:p>
+      <w:r>
+        <w:t>•</w:t>
+      </w:r>
+      <w:r>
+        <w:tab/>
+        <w:t>Contenga secciones mínimas: Hero + Problema/Solución + Cómo funciona + Módulos + Pricing (placeholder) + FAQ + CTA final.</w:t>
       </w:r>
     </w:p>
     <w:p>
@@ -2076,12 +2462,12 @@
     </w:p>
     <w:p>
       <w:r>
-        <w:t>9. Landing (marketing) — DIRECTIVA ACTUALIZADA</w:t>
-      </w:r>
-    </w:p>
-    <w:p>
-      <w:r>
-        <w:t>El landing actual es placeholder. Se construirá un landing profesional, llamativo y orientado a conversión, que:</w:t>
+        <w:t>10. Riesgos principales (vivos)</w:t>
+      </w:r>
+    </w:p>
+    <w:p>
+      <w:r>
+        <w:t>P0</w:t>
       </w:r>
     </w:p>
     <w:p>
@@ -2090,7 +2476,12 @@
       </w:r>
       <w:r>
         <w:tab/>
-        <w:t>Explique claramente qué es FinHub y qué resuelve.</w:t>
+        <w:t>i18n completo (UI + contenido + emails + PDFs) puede explotar en mantenimiento.</w:t>
+      </w:r>
+    </w:p>
+    <w:p>
+      <w:r>
+        <w:t>Mitigación: content registry + versionado y revisión editorial.</w:t>
       </w:r>
     </w:p>
     <w:p>
@@ -2099,7 +2490,17 @@
       </w:r>
       <w:r>
         <w:tab/>
-        <w:t>Muestre el flujo “pre-check gratis → pago → gestión completa con revisión humana”.</w:t>
+        <w:t>Autorización/machtiging por servicio debe ser viable sin credenciales.</w:t>
+      </w:r>
+    </w:p>
+    <w:p>
+      <w:r>
+        <w:t>Mitigación: “proof” estándar y fallback de soporte humano.</w:t>
+      </w:r>
+    </w:p>
+    <w:p>
+      <w:r>
+        <w:t>P1</w:t>
       </w:r>
     </w:p>
     <w:p>
@@ -2108,7 +2509,12 @@
       </w:r>
       <w:r>
         <w:tab/>
-        <w:t>Destaque confianza (seguridad, no credenciales DigiD, cumplimiento/GDPR).</w:t>
+        <w:t>OCR calidad variable.</w:t>
+      </w:r>
+    </w:p>
+    <w:p>
+      <w:r>
+        <w:t>Mitigación: editor obligatorio + confidence + checklist de calidad.</w:t>
       </w:r>
     </w:p>
     <w:p>
@@ -2117,7 +2523,17 @@
       </w:r>
       <w:r>
         <w:tab/>
-        <w:t>Incentive a continuar con CTA claras (“Empezar pre-check”, “Ver cómo funciona”, “Iniciar sesión”).</w:t>
+        <w:t>Revisión humana como cuello de botella.</w:t>
+      </w:r>
+    </w:p>
+    <w:p>
+      <w:r>
+        <w:t>Mitigación: cola priorizada por pago + panel operador eficiente.</w:t>
+      </w:r>
+    </w:p>
+    <w:p>
+      <w:r>
+        <w:t>P2</w:t>
       </w:r>
     </w:p>
     <w:p>
@@ -2126,7 +2542,28 @@
       </w:r>
       <w:r>
         <w:tab/>
-        <w:t>Soporte i18n (ES/PL/RO/EN) con selector discreto.</w:t>
+        <w:t>Seguros v2 requiere compliance adicional (intermediación/asesoramiento).</w:t>
+      </w:r>
+    </w:p>
+    <w:p>
+      <w:r>
+        <w:lastRenderedPageBreak/>
+        <w:t>Mitigación: limitar v1 a informativo + recomendaciones no intrusivas con consentimiento; v2 solo bajo marco completo.</w:t>
+      </w:r>
+    </w:p>
+    <w:p>
+      <w:r>
+        <w:t>________________________________________</w:t>
+      </w:r>
+    </w:p>
+    <w:p>
+      <w:r>
+        <w:t>11. VACÍOS / DATOS FALTANTES (sin preguntas)</w:t>
+      </w:r>
+    </w:p>
+    <w:p>
+      <w:r>
+        <w:t>P0 (CERRADOS)</w:t>
       </w:r>
     </w:p>
     <w:p>
@@ -2135,7 +2572,66 @@
       </w:r>
       <w:r>
         <w:tab/>
-        <w:t>Contenga secciones mínimas: Hero + Problema/Solución + Cómo funciona + Módulos + Pricing (placeholder) + FAQ + CTA final.</w:t>
+        <w:t>Autorización/machtiging: Modo A (machtigingscode/proof) como estándar; no credenciales DigiD.</w:t>
+      </w:r>
+    </w:p>
+    <w:p>
+      <w:r>
+        <w:t>•</w:t>
+      </w:r>
+      <w:r>
+        <w:tab/>
+        <w:t>Stack objetivo: Next.js + Supabase + Stripe + Azure AI Document Intelligence.</w:t>
+      </w:r>
+    </w:p>
+    <w:p>
+      <w:r>
+        <w:t>P1 (ABIERTOS)</w:t>
+      </w:r>
+    </w:p>
+    <w:p>
+      <w:r>
+        <w:t>•</w:t>
+      </w:r>
+      <w:r>
+        <w:tab/>
+        <w:t>Implementar Fase 6: Auth real (Supabase) + RLS + API (cases/case_step_data/documents/payments/consents) + upload Storage con signed URLs.</w:t>
+      </w:r>
+    </w:p>
+    <w:p>
+      <w:r>
+        <w:t>•</w:t>
+      </w:r>
+      <w:r>
+        <w:tab/>
+        <w:t>Implementar Stripe v1: suscripción + pago por caso + webhooks que actualicen Payment y CaseStatus.</w:t>
+      </w:r>
+    </w:p>
+    <w:p>
+      <w:r>
+        <w:t>•</w:t>
+      </w:r>
+      <w:r>
+        <w:tab/>
+        <w:t>Definir política exacta de frecuencia para sugerencias in-app y emails (cap) y su implementación técnica (Consent + throttling).</w:t>
+      </w:r>
+    </w:p>
+    <w:p>
+      <w:r>
+        <w:t>•</w:t>
+      </w:r>
+      <w:r>
+        <w:tab/>
+        <w:t>Definir cola admin/operator (UI + permisos) para revisión humana y cierre de casos.</w:t>
+      </w:r>
+    </w:p>
+    <w:p>
+      <w:r>
+        <w:t>•</w:t>
+      </w:r>
+      <w:r>
+        <w:tab/>
+        <w:t>Definir estructura final de landing (copy por idioma) y pricing v1.</w:t>
       </w:r>
     </w:p>
     <w:p>
@@ -2145,173 +2641,12 @@
     </w:p>
     <w:p>
       <w:r>
-        <w:t>10. Riesgos principales (vivos)</w:t>
-      </w:r>
-    </w:p>
-    <w:p>
-      <w:r>
-        <w:t>P0</w:t>
-      </w:r>
-    </w:p>
-    <w:p>
-      <w:r>
-        <w:t>•</w:t>
-      </w:r>
-      <w:r>
-        <w:tab/>
-        <w:t>i18n completo (UI + contenido + emails + PDFs) puede explotar en mantenimiento.</w:t>
-      </w:r>
-    </w:p>
-    <w:p>
-      <w:r>
-        <w:t>Mitigación: content registry + versionado y revisión editorial.</w:t>
-      </w:r>
-    </w:p>
-    <w:p>
-      <w:r>
-        <w:t>•</w:t>
-      </w:r>
-      <w:r>
-        <w:tab/>
-        <w:t>Autorización/machtiging por servicio debe ser viable sin credenciales.</w:t>
-      </w:r>
-    </w:p>
-    <w:p>
-      <w:r>
-        <w:t>Mitigación: “proof” estándar y fallback de soporte humano.</w:t>
-      </w:r>
-    </w:p>
-    <w:p>
-      <w:r>
-        <w:t>P1</w:t>
-      </w:r>
-    </w:p>
-    <w:p>
-      <w:r>
-        <w:t>•</w:t>
-      </w:r>
-      <w:r>
-        <w:tab/>
-        <w:t>OCR calidad variable.</w:t>
-      </w:r>
-    </w:p>
-    <w:p>
-      <w:r>
-        <w:t>Mitigación: editor obligatorio + confidence + checklist de calidad.</w:t>
-      </w:r>
-    </w:p>
-    <w:p>
-      <w:r>
-        <w:t>•</w:t>
-      </w:r>
-      <w:r>
-        <w:tab/>
-        <w:t>Revisión humana como cuello de botella.</w:t>
-      </w:r>
-    </w:p>
-    <w:p>
-      <w:r>
-        <w:t>Mitigación: cola priorizada por pago + panel operador eficiente.</w:t>
-      </w:r>
-    </w:p>
-    <w:p>
-      <w:r>
-        <w:t>P2</w:t>
-      </w:r>
-    </w:p>
-    <w:p>
-      <w:r>
-        <w:t>•</w:t>
-      </w:r>
-      <w:r>
-        <w:tab/>
-        <w:t>Seguros v2 requiere compliance adicional (intermediación/asesoramiento).</w:t>
-      </w:r>
-    </w:p>
-    <w:p>
-      <w:r>
-        <w:t>Mitigación: limitar v1 a informativo + recomendaciones no intrusivas con consentimiento; v2 solo bajo marco completo.</w:t>
-      </w:r>
-    </w:p>
-    <w:p>
-      <w:r>
-        <w:lastRenderedPageBreak/>
-        <w:t>________________________________________</w:t>
-      </w:r>
-    </w:p>
-    <w:p>
-      <w:r>
-        <w:t>11. VACÍOS / DATOS FALTANTES (sin preguntas)</w:t>
-      </w:r>
-    </w:p>
-    <w:p>
-      <w:r>
-        <w:t>P0 (CERRADOS)</w:t>
-      </w:r>
-    </w:p>
-    <w:p>
-      <w:r>
-        <w:t>•</w:t>
-      </w:r>
-      <w:r>
-        <w:tab/>
-        <w:t>Autorización/machtiging: Modo A (machtigingscode/proof) como estándar; no credenciales DigiD.</w:t>
-      </w:r>
-    </w:p>
-    <w:p>
-      <w:r>
-        <w:t>•</w:t>
-      </w:r>
-      <w:r>
-        <w:tab/>
-        <w:t>Stack objetivo: Next.js + Supabase + Stripe + Azure AI Document Intelligence.</w:t>
-      </w:r>
-    </w:p>
-    <w:p>
-      <w:r>
-        <w:t>P1 (ABIERTOS)</w:t>
-      </w:r>
-    </w:p>
-    <w:p>
-      <w:r>
-        <w:t>•</w:t>
-      </w:r>
-      <w:r>
-        <w:tab/>
-        <w:t>Definir entidades exactas de Case/Document/Consent/Offer (Fase 4).</w:t>
-      </w:r>
-    </w:p>
-    <w:p>
-      <w:r>
-        <w:t>•</w:t>
-      </w:r>
-      <w:r>
-        <w:tab/>
-        <w:t>Definir política exacta de frecuencia para sugerencias in-app y emails (cap).</w:t>
-      </w:r>
-    </w:p>
-    <w:p>
-      <w:r>
-        <w:t>•</w:t>
-      </w:r>
-      <w:r>
-        <w:tab/>
-        <w:t>Definir estructura final de landing (copy por idioma) y pricing v1.</w:t>
-      </w:r>
-    </w:p>
-    <w:p>
-      <w:r>
-        <w:t>________________________________________</w:t>
-      </w:r>
-    </w:p>
-    <w:p>
-      <w:r>
         <w:t>12. Próximo paso inmediato (siguiente fase)</w:t>
       </w:r>
     </w:p>
     <w:p>
       <w:r>
-        <w:t>Entramos a Fase 5 (Arquitectura frontend):</w:t>
+        <w:t>Entramos a Fase 6 (Backend Core en Supabase):</w:t>
       </w:r>
     </w:p>
     <w:p>
@@ -2320,7 +2655,7 @@
       </w:r>
       <w:r>
         <w:tab/>
-        <w:t>Definir entidad Case y routing por caso.</w:t>
+        <w:t>Definir e implementar Auth real (Supabase Auth) + profiles (idioma preferido) y route guard real.</w:t>
       </w:r>
     </w:p>
     <w:p>
@@ -2329,7 +2664,7 @@
       </w:r>
       <w:r>
         <w:tab/>
-        <w:t>Stores + persistencia (sesión, idioma, drafts de wizard).</w:t>
+        <w:t>Crear tablas + constraints + RLS según docs/db/schema-v1.sql y docs/db/rls-v1.md (cases, case_step_data, documents, payments, consents).</w:t>
       </w:r>
     </w:p>
     <w:p>
@@ -2338,7 +2673,7 @@
       </w:r>
       <w:r>
         <w:tab/>
-        <w:t>Document Vault v1: upload + listado + estado + asociación a case.</w:t>
+        <w:t>Implementar handlers API alineados a docs/openapi/finhub-v1.yaml (CRUD de casos, upsert de drafts por stepKey, asociación de documentos).</w:t>
       </w:r>
     </w:p>
     <w:p>
@@ -2347,7 +2682,25 @@
       </w:r>
       <w:r>
         <w:tab/>
-        <w:t>Preparar “Consent” (marketing emails) y “Offers” (recomendaciones no intrusivas) como estructuras, sin activar campañas agresivas.</w:t>
+        <w:t>Implementar subida de documentos vía Storage con signed URLs + asociación opcional a case (Document Vault v1→v1-backend).</w:t>
+      </w:r>
+    </w:p>
+    <w:p>
+      <w:r>
+        <w:t>6.</w:t>
+      </w:r>
+      <w:r>
+        <w:tab/>
+        <w:t>Crear cola admin/operator mínima (/admin/cases) y UI de revisión humana (cambiar status a under_review/completed).</w:t>
+      </w:r>
+    </w:p>
+    <w:p>
+      <w:r>
+        <w:t>5.</w:t>
+      </w:r>
+      <w:r>
+        <w:tab/>
+        <w:t>Integrar Stripe: checkout (suscripción + pay-per-case) + webhook /payments/webhook para persistir Payment y transicionar CaseStatus.</w:t>
       </w:r>
     </w:p>
     <w:p/>

</xml_diff>